<commit_message>
Agregado proyecto TV Argentina Online con imágenes PNG y SVG
</commit_message>
<xml_diff>
--- a/src/public/cv.docx
+++ b/src/public/cv.docx
@@ -4,40 +4,65 @@
   <w:body>
     <w:p>
       <w:pPr>
-        <w:pStyle w:val="Ttulo"/>
+        <w:jc w:val="center"/>
       </w:pPr>
       <w:r>
+        <w:rPr>
+          <w:b/>
+          <w:sz w:val="28"/>
+        </w:rPr>
         <w:t>Gabriel Gabrielli</w:t>
+      </w:r>
+      <w:r>
+        <w:rPr>
+          <w:b/>
+          <w:sz w:val="28"/>
+        </w:rPr>
+        <w:br/>
+      </w:r>
+      <w:r>
+        <w:rPr>
+          <w:sz w:val="24"/>
+          <w:szCs w:val="24"/>
+        </w:rPr>
+        <w:t xml:space="preserve">Moreno, Buenos Aires, </w:t>
+      </w:r>
+      <w:proofErr w:type="gramStart"/>
+      <w:r>
+        <w:rPr>
+          <w:sz w:val="24"/>
+          <w:szCs w:val="24"/>
+        </w:rPr>
+        <w:t xml:space="preserve">Argentina  </w:t>
+      </w:r>
+      <w:r>
+        <w:t>https://www.linkedin.com/in/gabriel-gabrielli-dev/</w:t>
+      </w:r>
+      <w:proofErr w:type="gramEnd"/>
+      <w:r>
+        <w:t xml:space="preserve"> </w:t>
       </w:r>
     </w:p>
     <w:p>
+      <w:pPr>
+        <w:jc w:val="center"/>
+        <w:rPr>
+          <w:sz w:val="24"/>
+          <w:szCs w:val="24"/>
+        </w:rPr>
+      </w:pPr>
       <w:r>
-        <w:t>Dirección: Moreno, Buenos Aires</w:t>
+        <w:rPr>
+          <w:sz w:val="24"/>
+          <w:szCs w:val="24"/>
+        </w:rPr>
+        <w:t>• +54 11 2167-4227 • gabgabrielligabriel@gmail.com</w:t>
       </w:r>
     </w:p>
+    <w:p/>
     <w:p>
       <w:r>
-        <w:t>Teléfono: +54 11 2167-4227</w:t>
-      </w:r>
-    </w:p>
-    <w:p>
-      <w:r>
-        <w:t>Email: gabgabrielligabriel@gmail.com</w:t>
-      </w:r>
-    </w:p>
-    <w:p>
-      <w:r>
-        <w:t>GitHub: https://github.com/gaby28894178</w:t>
-      </w:r>
-    </w:p>
-    <w:p>
-      <w:r>
-        <w:t>Portfolio: https://gabriellidev.netlify.app</w:t>
-      </w:r>
-    </w:p>
-    <w:p>
-      <w:r>
-        <w:t>LinkedIn: https://www.linkedin.com/in/gabriel-gabrielli-dev/</w:t>
+        <w:t>Desarrollador Full Stack con formación en Flask y Node.js, actualmente cursando la carrera de Diseño de Software Móvil en la Universidad UPATECO (modalidad a distancia). Apasionado por la tecnología y el aprendizaje continuo, con enfoque en el desarrollo de aplicaciones web y móviles modernas. Manejo sólido de tecnologías frontend y backend. Busco mi primera experiencia laboral en el área IT. Tecnologías principales: HTML, CSS, Bootstrap, Tailwind, JavaScript, Python, Flask, React, Node.js, JWT, Bcrypt, C.</w:t>
       </w:r>
     </w:p>
     <w:p>
@@ -45,12 +70,89 @@
         <w:pStyle w:val="Ttulo1"/>
       </w:pPr>
       <w:r>
-        <w:t>Perfil Profesional</w:t>
+        <w:br/>
+        <w:t>EXPERIENCIA PROFESIONAL</w:t>
+      </w:r>
+      <w:r>
+        <w:br/>
+        <w:t xml:space="preserve">freelanced  </w:t>
+      </w:r>
+    </w:p>
+    <w:p>
+      <w:pPr>
+        <w:pStyle w:val="Ttulo2"/>
+      </w:pPr>
+      <w:r>
+        <w:t>Desarrollo Full Stack Freelance</w:t>
       </w:r>
     </w:p>
     <w:p>
       <w:r>
-        <w:t>Desarrollador Full Stack con formación en Flask y Node.js. Actualmente cursando la carrera de Diseño de Software Móvil en la Universidad UPATECO (modalidad a distancia). Especializado en tecnologías modernas para el desarrollo web y móvil, con sólidos conocimientos en frontend y backend. Busco mi primera experiencia laboral en el área IT. Amplio conocimiento en lenguajes de programación: HTML, CSS, Bootstrap, Tailwind, JavaScript, Python, Flask, React, Node.js, JWT, Bcrypt y C.</w:t>
+        <w:t>2022 – Presente</w:t>
+      </w:r>
+    </w:p>
+    <w:p>
+      <w:r>
+        <w:t>● Desarrollo de aplicaciones web personalizadas con tecnologías modernas.</w:t>
+      </w:r>
+    </w:p>
+    <w:p>
+      <w:r>
+        <w:t>● Creación de APIs RESTful utilizando Node.js/Express y Flask.</w:t>
+      </w:r>
+    </w:p>
+    <w:p>
+      <w:r>
+        <w:t>● Modelado e implementación de bases de datos relacionales (PostgreSQL, MySQL, SQLite).</w:t>
+      </w:r>
+    </w:p>
+    <w:p>
+      <w:r>
+        <w:t>● Diseño responsive con Tailwind CSS y Bootstrap 5.</w:t>
+      </w:r>
+    </w:p>
+    <w:p>
+      <w:r>
+        <w:t>Proyecto destacado: API REST para E-commerce (Node.js + Express + Sequelize)</w:t>
+      </w:r>
+    </w:p>
+    <w:p>
+      <w:r>
+        <w:t>● Diseño de la estructura de base de datos.</w:t>
+      </w:r>
+    </w:p>
+    <w:p>
+      <w:r>
+        <w:t>● Desarrollo de endpoints CRUD para productos y usuarios.</w:t>
+      </w:r>
+    </w:p>
+    <w:p>
+      <w:r>
+        <w:t xml:space="preserve">● </w:t>
+      </w:r>
+      <w:proofErr w:type="spellStart"/>
+      <w:r>
+        <w:t>Integración</w:t>
+      </w:r>
+      <w:proofErr w:type="spellEnd"/>
+      <w:r>
+        <w:t xml:space="preserve"> con frontend </w:t>
+      </w:r>
+      <w:proofErr w:type="spellStart"/>
+      <w:r>
+        <w:t>desarrollado</w:t>
+      </w:r>
+      <w:proofErr w:type="spellEnd"/>
+      <w:r>
+        <w:t xml:space="preserve"> </w:t>
+      </w:r>
+      <w:proofErr w:type="spellStart"/>
+      <w:r>
+        <w:t>en</w:t>
+      </w:r>
+      <w:proofErr w:type="spellEnd"/>
+      <w:r>
+        <w:t xml:space="preserve"> React.</w:t>
       </w:r>
     </w:p>
     <w:p>
@@ -58,7 +160,8 @@
         <w:pStyle w:val="Ttulo1"/>
       </w:pPr>
       <w:r>
-        <w:t>Formación Académica</w:t>
+        <w:br/>
+        <w:t>EDUCACIÓN</w:t>
       </w:r>
     </w:p>
     <w:p>
@@ -78,29 +181,13 @@
     </w:p>
     <w:p>
       <w:r>
-        <w:t xml:space="preserve">Estado: En </w:t>
+        <w:lastRenderedPageBreak/>
+        <w:t>Estado: En curso</w:t>
       </w:r>
-      <w:proofErr w:type="spellStart"/>
+    </w:p>
+    <w:p>
       <w:r>
-        <w:t>curso</w:t>
-      </w:r>
-      <w:proofErr w:type="spellEnd"/>
-      <w:r>
-        <w:t xml:space="preserve"> (202</w:t>
-      </w:r>
-      <w:r>
-        <w:t>5</w:t>
-      </w:r>
-      <w:r>
-        <w:t xml:space="preserve"> - </w:t>
-      </w:r>
-      <w:proofErr w:type="spellStart"/>
-      <w:r>
-        <w:t>presente</w:t>
-      </w:r>
-      <w:proofErr w:type="spellEnd"/>
-      <w:r>
-        <w:t>)</w:t>
+        <w:t>Período: 2025 – Actualidad</w:t>
       </w:r>
     </w:p>
     <w:p>
@@ -108,412 +195,33 @@
         <w:pStyle w:val="Ttulo1"/>
       </w:pPr>
       <w:r>
-        <w:t xml:space="preserve">Cursos y </w:t>
-      </w:r>
-      <w:proofErr w:type="spellStart"/>
-      <w:r>
-        <w:t>Certificaciones</w:t>
-      </w:r>
-      <w:proofErr w:type="spellEnd"/>
-    </w:p>
-    <w:tbl>
-      <w:tblPr>
-        <w:tblStyle w:val="Tablaconcuadrcula"/>
-        <w:tblW w:w="9827" w:type="dxa"/>
-        <w:tblLook w:val="04A0" w:firstRow="1" w:lastRow="0" w:firstColumn="1" w:lastColumn="0" w:noHBand="0" w:noVBand="1"/>
-      </w:tblPr>
-      <w:tblGrid>
-        <w:gridCol w:w="4637"/>
-        <w:gridCol w:w="3225"/>
-        <w:gridCol w:w="1965"/>
-      </w:tblGrid>
-      <w:tr>
-        <w:trPr>
-          <w:trHeight w:val="280"/>
-        </w:trPr>
-        <w:tc>
-          <w:tcPr>
-            <w:tcW w:w="4637" w:type="dxa"/>
-          </w:tcPr>
-          <w:p>
-            <w:pPr>
-              <w:jc w:val="center"/>
-            </w:pPr>
-            <w:proofErr w:type="spellStart"/>
-            <w:r>
-              <w:t>Curso</w:t>
-            </w:r>
-            <w:proofErr w:type="spellEnd"/>
-          </w:p>
-        </w:tc>
-        <w:tc>
-          <w:tcPr>
-            <w:tcW w:w="3225" w:type="dxa"/>
-          </w:tcPr>
-          <w:p>
-            <w:pPr>
-              <w:jc w:val="center"/>
-            </w:pPr>
-            <w:r>
-              <w:t>Institución</w:t>
-            </w:r>
-          </w:p>
-        </w:tc>
-        <w:tc>
-          <w:tcPr>
-            <w:tcW w:w="1965" w:type="dxa"/>
-          </w:tcPr>
-          <w:p>
-            <w:pPr>
-              <w:jc w:val="center"/>
-            </w:pPr>
-            <w:r>
-              <w:t>Año</w:t>
-            </w:r>
-          </w:p>
-        </w:tc>
-      </w:tr>
-      <w:tr>
-        <w:trPr>
-          <w:trHeight w:val="280"/>
-        </w:trPr>
-        <w:tc>
-          <w:tcPr>
-            <w:tcW w:w="4637" w:type="dxa"/>
-          </w:tcPr>
-          <w:p>
-            <w:pPr>
-              <w:jc w:val="center"/>
-            </w:pPr>
-            <w:r>
-              <w:t>JavaScript Moderno</w:t>
-            </w:r>
-          </w:p>
-        </w:tc>
-        <w:tc>
-          <w:tcPr>
-            <w:tcW w:w="3225" w:type="dxa"/>
-          </w:tcPr>
-          <w:p>
-            <w:pPr>
-              <w:jc w:val="center"/>
-            </w:pPr>
-            <w:r>
-              <w:t>Udemy</w:t>
-            </w:r>
-          </w:p>
-        </w:tc>
-        <w:tc>
-          <w:tcPr>
-            <w:tcW w:w="1965" w:type="dxa"/>
-          </w:tcPr>
-          <w:p>
-            <w:pPr>
-              <w:jc w:val="center"/>
-            </w:pPr>
-            <w:r>
-              <w:t>2022</w:t>
-            </w:r>
-          </w:p>
-        </w:tc>
-      </w:tr>
-      <w:tr>
-        <w:trPr>
-          <w:trHeight w:val="280"/>
-        </w:trPr>
-        <w:tc>
-          <w:tcPr>
-            <w:tcW w:w="4637" w:type="dxa"/>
-          </w:tcPr>
-          <w:p>
-            <w:pPr>
-              <w:jc w:val="center"/>
-            </w:pPr>
-            <w:r>
-              <w:t>HTML5 y CSS3</w:t>
-            </w:r>
-            <w:r>
-              <w:t xml:space="preserve"> React Nodejs </w:t>
-            </w:r>
-          </w:p>
-        </w:tc>
-        <w:tc>
-          <w:tcPr>
-            <w:tcW w:w="3225" w:type="dxa"/>
-          </w:tcPr>
-          <w:p>
-            <w:pPr>
-              <w:jc w:val="center"/>
-            </w:pPr>
-            <w:r>
-              <w:t>Academlo</w:t>
-            </w:r>
-          </w:p>
-        </w:tc>
-        <w:tc>
-          <w:tcPr>
-            <w:tcW w:w="1965" w:type="dxa"/>
-          </w:tcPr>
-          <w:p>
-            <w:pPr>
-              <w:jc w:val="center"/>
-            </w:pPr>
-            <w:r>
-              <w:t>2024</w:t>
-            </w:r>
-          </w:p>
-        </w:tc>
-      </w:tr>
-      <w:tr>
-        <w:trPr>
-          <w:trHeight w:val="280"/>
-        </w:trPr>
-        <w:tc>
-          <w:tcPr>
-            <w:tcW w:w="4637" w:type="dxa"/>
-          </w:tcPr>
-          <w:p>
-            <w:pPr>
-              <w:jc w:val="center"/>
-            </w:pPr>
-            <w:r>
-              <w:t>Python y Flask</w:t>
-            </w:r>
-          </w:p>
-        </w:tc>
-        <w:tc>
-          <w:tcPr>
-            <w:tcW w:w="3225" w:type="dxa"/>
-          </w:tcPr>
-          <w:p>
-            <w:pPr>
-              <w:jc w:val="center"/>
-            </w:pPr>
-            <w:r>
-              <w:t>Codo a Codo</w:t>
-            </w:r>
-          </w:p>
-        </w:tc>
-        <w:tc>
-          <w:tcPr>
-            <w:tcW w:w="1965" w:type="dxa"/>
-          </w:tcPr>
-          <w:p>
-            <w:pPr>
-              <w:jc w:val="center"/>
-            </w:pPr>
-            <w:r>
-              <w:t>2024</w:t>
-            </w:r>
-          </w:p>
-        </w:tc>
-      </w:tr>
-      <w:tr>
-        <w:trPr>
-          <w:trHeight w:val="280"/>
-        </w:trPr>
-        <w:tc>
-          <w:tcPr>
-            <w:tcW w:w="4637" w:type="dxa"/>
-          </w:tcPr>
-          <w:p>
-            <w:pPr>
-              <w:jc w:val="center"/>
-            </w:pPr>
-            <w:r>
-              <w:t xml:space="preserve">C shard </w:t>
-            </w:r>
-          </w:p>
-        </w:tc>
-        <w:tc>
-          <w:tcPr>
-            <w:tcW w:w="3225" w:type="dxa"/>
-          </w:tcPr>
-          <w:p>
-            <w:pPr>
-              <w:jc w:val="center"/>
-            </w:pPr>
-            <w:r>
-              <w:t>Platzi</w:t>
-            </w:r>
-          </w:p>
-        </w:tc>
-        <w:tc>
-          <w:tcPr>
-            <w:tcW w:w="1965" w:type="dxa"/>
-          </w:tcPr>
-          <w:p>
-            <w:pPr>
-              <w:jc w:val="center"/>
-            </w:pPr>
-            <w:r>
-              <w:t>2025</w:t>
-            </w:r>
-          </w:p>
-        </w:tc>
-      </w:tr>
-      <w:tr>
-        <w:trPr>
-          <w:trHeight w:val="280"/>
-        </w:trPr>
-        <w:tc>
-          <w:tcPr>
-            <w:tcW w:w="4637" w:type="dxa"/>
-          </w:tcPr>
-          <w:p>
-            <w:pPr>
-              <w:jc w:val="center"/>
-            </w:pPr>
-            <w:r>
-              <w:t>Bases de Datos SQL</w:t>
-            </w:r>
-          </w:p>
-        </w:tc>
-        <w:tc>
-          <w:tcPr>
-            <w:tcW w:w="3225" w:type="dxa"/>
-          </w:tcPr>
-          <w:p>
-            <w:pPr>
-              <w:jc w:val="center"/>
-            </w:pPr>
-            <w:r>
-              <w:t>Udemy</w:t>
-            </w:r>
-          </w:p>
-        </w:tc>
-        <w:tc>
-          <w:tcPr>
-            <w:tcW w:w="1965" w:type="dxa"/>
-          </w:tcPr>
-          <w:p>
-            <w:pPr>
-              <w:jc w:val="center"/>
-            </w:pPr>
-            <w:r>
-              <w:t>2021</w:t>
-            </w:r>
-          </w:p>
-        </w:tc>
-      </w:tr>
-      <w:tr>
-        <w:trPr>
-          <w:trHeight w:val="280"/>
-        </w:trPr>
-        <w:tc>
-          <w:tcPr>
-            <w:tcW w:w="4637" w:type="dxa"/>
-          </w:tcPr>
-          <w:p>
-            <w:pPr>
-              <w:jc w:val="center"/>
-            </w:pPr>
-          </w:p>
-        </w:tc>
-        <w:tc>
-          <w:tcPr>
-            <w:tcW w:w="3225" w:type="dxa"/>
-          </w:tcPr>
-          <w:p>
-            <w:pPr>
-              <w:jc w:val="center"/>
-            </w:pPr>
-          </w:p>
-        </w:tc>
-        <w:tc>
-          <w:tcPr>
-            <w:tcW w:w="1965" w:type="dxa"/>
-          </w:tcPr>
-          <w:p>
-            <w:pPr>
-              <w:jc w:val="center"/>
-            </w:pPr>
-          </w:p>
-        </w:tc>
-      </w:tr>
-    </w:tbl>
-    <w:p>
-      <w:pPr>
-        <w:pStyle w:val="Ttulo1"/>
-      </w:pPr>
-      <w:proofErr w:type="spellStart"/>
-      <w:r>
-        <w:lastRenderedPageBreak/>
-        <w:t>Experiencia</w:t>
-      </w:r>
-      <w:proofErr w:type="spellEnd"/>
-      <w:r>
-        <w:t xml:space="preserve"> Laboral</w:t>
+        <w:br/>
+        <w:t>CURSOS Y CERTIFICACIONES</w:t>
       </w:r>
     </w:p>
     <w:p>
       <w:r>
-        <w:t>Desarrollador Full Stack Freelance</w:t>
-      </w:r>
-      <w:r>
-        <w:br/>
-        <w:t>2022 - Presente</w:t>
-      </w:r>
-    </w:p>
-    <w:p>
-      <w:pPr>
-        <w:pStyle w:val="Listaconvietas"/>
-      </w:pPr>
-      <w:r>
-        <w:t>- Desarrollo de aplicaciones web personalizadas.</w:t>
-      </w:r>
-    </w:p>
-    <w:p>
-      <w:pPr>
-        <w:pStyle w:val="Listaconvietas"/>
-      </w:pPr>
-      <w:r>
-        <w:t>- Creación de APIs RESTful con Node.js/Express y Flask.</w:t>
-      </w:r>
-    </w:p>
-    <w:p>
-      <w:pPr>
-        <w:pStyle w:val="Listaconvietas"/>
-      </w:pPr>
-      <w:r>
-        <w:t>- Implementación de bases de datos relacionales.</w:t>
-      </w:r>
-    </w:p>
-    <w:p>
-      <w:pPr>
-        <w:pStyle w:val="Listaconvietas"/>
-      </w:pPr>
-      <w:r>
-        <w:t>- Maquetación responsive con Tailwind y Bootstrap.</w:t>
+        <w:t>● Python y Flask – Codo a Codo (2024)</w:t>
       </w:r>
     </w:p>
     <w:p>
       <w:r>
-        <w:t>Proyecto destacado: API REST para E-commerce (Node.js + Express + Sequelize)</w:t>
+        <w:t>● HTML5, CSS3, React y Node.js – Academlo (2024)</w:t>
       </w:r>
     </w:p>
     <w:p>
-      <w:pPr>
-        <w:pStyle w:val="Listaconvietas"/>
-      </w:pPr>
       <w:r>
-        <w:t>- Diseño de estructura de base de datos.</w:t>
+        <w:t>● JavaScript Moderno – Udemy (2022)</w:t>
       </w:r>
     </w:p>
     <w:p>
-      <w:pPr>
-        <w:pStyle w:val="Listaconvietas"/>
-      </w:pPr>
       <w:r>
-        <w:t>- Desarrollo de endpoints para productos y usuarios.</w:t>
+        <w:t>● Bases de Datos SQL – Udemy (2021)</w:t>
       </w:r>
     </w:p>
     <w:p>
-      <w:pPr>
-        <w:pStyle w:val="Listaconvietas"/>
-      </w:pPr>
       <w:r>
-        <w:t>- Integración con frontend en React.</w:t>
+        <w:t>● C# (C sharp) – Platzi (2025)</w:t>
       </w:r>
     </w:p>
     <w:p>
@@ -521,248 +229,52 @@
         <w:pStyle w:val="Ttulo1"/>
       </w:pPr>
       <w:r>
-        <w:t>Herramientas y Habilidades</w:t>
+        <w:br/>
+        <w:t>HABILIDADES TÉCNICAS</w:t>
       </w:r>
     </w:p>
-    <w:tbl>
-      <w:tblPr>
-        <w:tblStyle w:val="Tablaconcuadrcula"/>
-        <w:tblW w:w="0" w:type="auto"/>
-        <w:tblLook w:val="04A0" w:firstRow="1" w:lastRow="0" w:firstColumn="1" w:lastColumn="0" w:noHBand="0" w:noVBand="1"/>
-      </w:tblPr>
-      <w:tblGrid>
-        <w:gridCol w:w="2160"/>
-        <w:gridCol w:w="2160"/>
-        <w:gridCol w:w="2160"/>
-        <w:gridCol w:w="2160"/>
-      </w:tblGrid>
-      <w:tr>
-        <w:tc>
-          <w:tcPr>
-            <w:tcW w:w="2160" w:type="dxa"/>
-          </w:tcPr>
-          <w:p>
-            <w:r>
-              <w:t>Frontend</w:t>
-            </w:r>
-          </w:p>
-        </w:tc>
-        <w:tc>
-          <w:tcPr>
-            <w:tcW w:w="2160" w:type="dxa"/>
-          </w:tcPr>
-          <w:p>
-            <w:r>
-              <w:t>Backend</w:t>
-            </w:r>
-          </w:p>
-        </w:tc>
-        <w:tc>
-          <w:tcPr>
-            <w:tcW w:w="2160" w:type="dxa"/>
-          </w:tcPr>
-          <w:p>
-            <w:r>
-              <w:t>Bases de Datos</w:t>
-            </w:r>
-          </w:p>
-        </w:tc>
-        <w:tc>
-          <w:tcPr>
-            <w:tcW w:w="2160" w:type="dxa"/>
-          </w:tcPr>
-          <w:p>
-            <w:r>
-              <w:t>Herramientas de Desarrollo</w:t>
-            </w:r>
-          </w:p>
-        </w:tc>
-      </w:tr>
-      <w:tr>
-        <w:tc>
-          <w:tcPr>
-            <w:tcW w:w="2160" w:type="dxa"/>
-          </w:tcPr>
-          <w:p>
-            <w:r>
-              <w:t>JavaScript (ES6+)</w:t>
-            </w:r>
-          </w:p>
-        </w:tc>
-        <w:tc>
-          <w:tcPr>
-            <w:tcW w:w="2160" w:type="dxa"/>
-          </w:tcPr>
-          <w:p>
-            <w:r>
-              <w:t>Node.js</w:t>
-            </w:r>
-          </w:p>
-        </w:tc>
-        <w:tc>
-          <w:tcPr>
-            <w:tcW w:w="2160" w:type="dxa"/>
-          </w:tcPr>
-          <w:p>
-            <w:r>
-              <w:t>PostgreSQL</w:t>
-            </w:r>
-          </w:p>
-        </w:tc>
-        <w:tc>
-          <w:tcPr>
-            <w:tcW w:w="2160" w:type="dxa"/>
-          </w:tcPr>
-          <w:p>
-            <w:r>
-              <w:t>Git / GitHub</w:t>
-            </w:r>
-          </w:p>
-        </w:tc>
-      </w:tr>
-      <w:tr>
-        <w:tc>
-          <w:tcPr>
-            <w:tcW w:w="2160" w:type="dxa"/>
-          </w:tcPr>
-          <w:p>
-            <w:r>
-              <w:t>HTML5 / CSS3</w:t>
-            </w:r>
-          </w:p>
-        </w:tc>
-        <w:tc>
-          <w:tcPr>
-            <w:tcW w:w="2160" w:type="dxa"/>
-          </w:tcPr>
-          <w:p>
-            <w:r>
-              <w:t>Express.js</w:t>
-            </w:r>
-          </w:p>
-        </w:tc>
-        <w:tc>
-          <w:tcPr>
-            <w:tcW w:w="2160" w:type="dxa"/>
-          </w:tcPr>
-          <w:p>
-            <w:r>
-              <w:t>MySQL</w:t>
-            </w:r>
-          </w:p>
-        </w:tc>
-        <w:tc>
-          <w:tcPr>
-            <w:tcW w:w="2160" w:type="dxa"/>
-          </w:tcPr>
-          <w:p>
-            <w:r>
-              <w:t>Visual Studio Code</w:t>
-            </w:r>
-          </w:p>
-        </w:tc>
-      </w:tr>
-      <w:tr>
-        <w:tc>
-          <w:tcPr>
-            <w:tcW w:w="2160" w:type="dxa"/>
-          </w:tcPr>
-          <w:p>
-            <w:r>
-              <w:t>Tailwind CSS</w:t>
-            </w:r>
-          </w:p>
-        </w:tc>
-        <w:tc>
-          <w:tcPr>
-            <w:tcW w:w="2160" w:type="dxa"/>
-          </w:tcPr>
-          <w:p>
-            <w:r>
-              <w:t>Python</w:t>
-            </w:r>
-          </w:p>
-        </w:tc>
-        <w:tc>
-          <w:tcPr>
-            <w:tcW w:w="2160" w:type="dxa"/>
-          </w:tcPr>
-          <w:p>
-            <w:r>
-              <w:t>SQLite</w:t>
-            </w:r>
-          </w:p>
-        </w:tc>
-        <w:tc>
-          <w:tcPr>
-            <w:tcW w:w="2160" w:type="dxa"/>
-          </w:tcPr>
-          <w:p>
-            <w:r>
-              <w:t>Postman</w:t>
-            </w:r>
-          </w:p>
-        </w:tc>
-      </w:tr>
-      <w:tr>
-        <w:tc>
-          <w:tcPr>
-            <w:tcW w:w="2160" w:type="dxa"/>
-          </w:tcPr>
-          <w:p>
-            <w:r>
-              <w:t>Bootstrap 5</w:t>
-            </w:r>
-          </w:p>
-        </w:tc>
-        <w:tc>
-          <w:tcPr>
-            <w:tcW w:w="2160" w:type="dxa"/>
-          </w:tcPr>
-          <w:p>
-            <w:r>
-              <w:t>Flask</w:t>
-            </w:r>
-          </w:p>
-        </w:tc>
-        <w:tc>
-          <w:tcPr>
-            <w:tcW w:w="2160" w:type="dxa"/>
-          </w:tcPr>
-          <w:p>
-            <w:r>
-              <w:t>SQL Server (XAMPP)</w:t>
-            </w:r>
-          </w:p>
-        </w:tc>
-        <w:tc>
-          <w:tcPr>
-            <w:tcW w:w="2160" w:type="dxa"/>
-          </w:tcPr>
-          <w:p>
-            <w:r>
-              <w:t>XAMPP / WAMP</w:t>
-            </w:r>
-          </w:p>
-        </w:tc>
-      </w:tr>
-    </w:tbl>
+    <w:p>
+      <w:r>
+        <w:t>● Frontend: HTML5, CSS3, JavaScript (ES6+), Tailwind CSS, Bootstrap 5, React</w:t>
+      </w:r>
+    </w:p>
+    <w:p>
+      <w:r>
+        <w:t>● Backend: Node.js, Express.js, Python, Flask</w:t>
+      </w:r>
+    </w:p>
+    <w:p>
+      <w:r>
+        <w:t>● Bases de Datos: PostgreSQL, MySQL, SQLite, SQL Server (XAMPP)</w:t>
+      </w:r>
+    </w:p>
+    <w:p>
+      <w:r>
+        <w:t>● Herramientas: Git/GitHub, Visual Studio Code, Postman, XAMPP/WAMP</w:t>
+      </w:r>
+    </w:p>
+    <w:p>
+      <w:pPr>
+        <w:pStyle w:val="Ttulo1"/>
+      </w:pPr>
+    </w:p>
     <w:p>
       <w:pPr>
         <w:pStyle w:val="Ttulo1"/>
       </w:pPr>
       <w:r>
-        <w:t>Idiomas</w:t>
+        <w:br/>
+        <w:t>IDIOMAS</w:t>
       </w:r>
     </w:p>
     <w:p>
       <w:r>
-        <w:t>Español: Nativo</w:t>
+        <w:t>● Español: Nativo</w:t>
       </w:r>
     </w:p>
     <w:p>
       <w:r>
-        <w:t>Inglés: Técnico (lectura y escritura)</w:t>
+        <w:t>● Inglés: Técnico (lectura y escritura)</w:t>
       </w:r>
     </w:p>
     <w:p>
@@ -770,14 +282,10 @@
         <w:pStyle w:val="Ttulo1"/>
       </w:pPr>
       <w:r>
-        <w:t>Referencias</w:t>
+        <w:br/>
       </w:r>
     </w:p>
-    <w:p>
-      <w:r>
-        <w:t>Disponibles a solicitud.</w:t>
-      </w:r>
-    </w:p>
+    <w:p/>
     <w:sectPr>
       <w:pgSz w:w="12240" w:h="15840"/>
       <w:pgMar w:top="1440" w:right="1800" w:bottom="1440" w:left="1800" w:header="720" w:footer="720" w:gutter="0"/>
@@ -961,31 +469,31 @@
       </w:rPr>
     </w:lvl>
   </w:abstractNum>
-  <w:num w:numId="1" w16cid:durableId="58137913">
+  <w:num w:numId="1" w16cid:durableId="155802478">
     <w:abstractNumId w:val="8"/>
   </w:num>
-  <w:num w:numId="2" w16cid:durableId="1926066653">
+  <w:num w:numId="2" w16cid:durableId="437066757">
     <w:abstractNumId w:val="6"/>
   </w:num>
-  <w:num w:numId="3" w16cid:durableId="1121341438">
+  <w:num w:numId="3" w16cid:durableId="61102175">
     <w:abstractNumId w:val="5"/>
   </w:num>
-  <w:num w:numId="4" w16cid:durableId="1461534190">
+  <w:num w:numId="4" w16cid:durableId="2075345839">
     <w:abstractNumId w:val="4"/>
   </w:num>
-  <w:num w:numId="5" w16cid:durableId="777410076">
+  <w:num w:numId="5" w16cid:durableId="410737549">
     <w:abstractNumId w:val="7"/>
   </w:num>
-  <w:num w:numId="6" w16cid:durableId="29186810">
+  <w:num w:numId="6" w16cid:durableId="1248462814">
     <w:abstractNumId w:val="3"/>
   </w:num>
-  <w:num w:numId="7" w16cid:durableId="1689524427">
+  <w:num w:numId="7" w16cid:durableId="1340426720">
     <w:abstractNumId w:val="2"/>
   </w:num>
-  <w:num w:numId="8" w16cid:durableId="331029146">
+  <w:num w:numId="8" w16cid:durableId="1085955977">
     <w:abstractNumId w:val="1"/>
   </w:num>
-  <w:num w:numId="9" w16cid:durableId="729235688">
+  <w:num w:numId="9" w16cid:durableId="1245451519">
     <w:abstractNumId w:val="0"/>
   </w:num>
 </w:numbering>
@@ -1381,9 +889,6 @@
     <w:name w:val="Normal"/>
     <w:qFormat/>
     <w:rsid w:val="00FC693F"/>
-    <w:rPr>
-      <w:rFonts w:ascii="Arial" w:hAnsi="Arial"/>
-    </w:rPr>
   </w:style>
   <w:style w:type="paragraph" w:styleId="Ttulo1">
     <w:name w:val="heading 1"/>

</xml_diff>